<commit_message>
update the documentation link to proper short link rather than click here
</commit_message>
<xml_diff>
--- a/documentation/working-documents/Product_Manual_Adapted_Recorder_Button.docx
+++ b/documentation/working-documents/Product_Manual_Adapted_Recorder_Button.docx
@@ -58,19 +58,19 @@
         <w:rPr/>
         <w:drawing>
           <wp:inline distB="114300" distT="114300" distL="114300" distR="114300">
-            <wp:extent cx="5495925" cy="3469135"/>
+            <wp:extent cx="4435313" cy="2792604"/>
             <wp:effectExtent b="0" l="0" r="0" t="0"/>
-            <wp:docPr id="12" name="image16.jpg"/>
+            <wp:docPr id="12" name="image13.jpg"/>
             <a:graphic>
               <a:graphicData uri="http://schemas.openxmlformats.org/drawingml/2006/picture">
                 <pic:pic>
                   <pic:nvPicPr>
-                    <pic:cNvPr id="0" name="image16.jpg"/>
+                    <pic:cNvPr id="0" name="image13.jpg"/>
                     <pic:cNvPicPr preferRelativeResize="0"/>
                   </pic:nvPicPr>
                   <pic:blipFill>
                     <a:blip r:embed="rId6"/>
-                    <a:srcRect b="37367" l="0" r="4152" t="28652"/>
+                    <a:srcRect b="37367" l="0" r="4153" t="28653"/>
                     <a:stretch>
                       <a:fillRect/>
                     </a:stretch>
@@ -78,7 +78,7 @@
                   <pic:spPr>
                     <a:xfrm>
                       <a:off x="0" y="0"/>
-                      <a:ext cx="5495925" cy="3469135"/>
+                      <a:ext cx="4435313" cy="2792604"/>
                     </a:xfrm>
                     <a:prstGeom prst="rect"/>
                     <a:ln/>
@@ -125,17 +125,17 @@
             <wp:extent cx="1800000" cy="1800000"/>
             <wp:effectExtent b="0" l="0" r="0" t="0"/>
             <wp:wrapSquare wrapText="bothSides" distB="114300" distT="114300" distL="114300" distR="114300"/>
-            <wp:docPr id="10" name="image2.png"/>
+            <wp:docPr id="10" name="image4.png"/>
             <a:graphic>
               <a:graphicData uri="http://schemas.openxmlformats.org/drawingml/2006/picture">
                 <pic:pic>
                   <pic:nvPicPr>
-                    <pic:cNvPr id="0" name="image2.png"/>
+                    <pic:cNvPr id="0" name="image4.png"/>
                     <pic:cNvPicPr preferRelativeResize="0"/>
                   </pic:nvPicPr>
                   <pic:blipFill>
                     <a:blip r:embed="rId7"/>
-                    <a:srcRect b="12071" l="26377" r="24108" t="12087"/>
+                    <a:srcRect b="12072" l="26378" r="24109" t="12087"/>
                     <a:stretch>
                       <a:fillRect/>
                     </a:stretch>
@@ -215,26 +215,7 @@
     </w:p>
     <w:p>
       <w:pPr>
-        <w:rPr/>
-      </w:pPr>
-      <w:r>
-        <w:rPr>
-          <w:rtl w:val="0"/>
-        </w:rPr>
-      </w:r>
-    </w:p>
-    <w:p>
-      <w:pPr>
-        <w:rPr/>
-      </w:pPr>
-      <w:r>
-        <w:rPr>
-          <w:rtl w:val="0"/>
-        </w:rPr>
-      </w:r>
-    </w:p>
-    <w:p>
-      <w:pPr>
+        <w:ind w:left="0" w:firstLine="0"/>
         <w:rPr/>
       </w:pPr>
       <w:r>
@@ -415,7 +396,7 @@
     </w:p>
     <w:sdt>
       <w:sdtPr>
-        <w:id w:val="792257905"/>
+        <w:id w:val="608025890"/>
         <w:docPartObj>
           <w:docPartGallery w:val="Table of Contents"/>
           <w:docPartUnique w:val="1"/>
@@ -1635,12 +1616,12 @@
           <wp:inline distB="114300" distT="114300" distL="114300" distR="114300">
             <wp:extent cx="2762250" cy="2000250"/>
             <wp:effectExtent b="0" l="0" r="0" t="0"/>
-            <wp:docPr id="17" name="image3.png"/>
+            <wp:docPr id="17" name="image5.png"/>
             <a:graphic>
               <a:graphicData uri="http://schemas.openxmlformats.org/drawingml/2006/picture">
                 <pic:pic>
                   <pic:nvPicPr>
-                    <pic:cNvPr id="0" name="image3.png"/>
+                    <pic:cNvPr id="0" name="image5.png"/>
                     <pic:cNvPicPr preferRelativeResize="0"/>
                   </pic:nvPicPr>
                   <pic:blipFill>
@@ -2060,17 +2041,17 @@
           <wp:inline distB="114300" distT="114300" distL="114300" distR="114300">
             <wp:extent cx="5568604" cy="5308389"/>
             <wp:effectExtent b="0" l="0" r="0" t="0"/>
-            <wp:docPr id="11" name="image18.jpg"/>
+            <wp:docPr id="11" name="image20.jpg"/>
             <a:graphic>
               <a:graphicData uri="http://schemas.openxmlformats.org/drawingml/2006/picture">
                 <pic:pic>
                   <pic:nvPicPr>
-                    <pic:cNvPr id="0" name="image18.jpg"/>
+                    <pic:cNvPr id="0" name="image20.jpg"/>
                     <pic:cNvPicPr preferRelativeResize="0"/>
                   </pic:nvPicPr>
                   <pic:blipFill>
                     <a:blip r:embed="rId10"/>
-                    <a:srcRect b="22032" l="0" r="0" t="24168"/>
+                    <a:srcRect b="22033" l="0" r="0" t="24169"/>
                     <a:stretch>
                       <a:fillRect/>
                     </a:stretch>
@@ -2219,83 +2200,105 @@
     <w:tbl>
       <w:tblPr>
         <w:tblStyle w:val="Table2"/>
-        <w:tblW w:w="8940.0" w:type="dxa"/>
+        <w:tblW w:w="9270.0" w:type="dxa"/>
         <w:jc w:val="left"/>
         <w:tblBorders>
-          <w:top w:color="000000" w:space="0" w:sz="8" w:val="single"/>
-          <w:left w:color="000000" w:space="0" w:sz="8" w:val="single"/>
-          <w:bottom w:color="000000" w:space="0" w:sz="8" w:val="single"/>
-          <w:right w:color="000000" w:space="0" w:sz="8" w:val="single"/>
-          <w:insideH w:color="000000" w:space="0" w:sz="8" w:val="single"/>
-          <w:insideV w:color="000000" w:space="0" w:sz="8" w:val="single"/>
+          <w:top w:color="000000" w:space="0" w:sz="0" w:val="nil"/>
+          <w:left w:color="000000" w:space="0" w:sz="0" w:val="nil"/>
+          <w:bottom w:color="000000" w:space="0" w:sz="0" w:val="nil"/>
+          <w:right w:color="000000" w:space="0" w:sz="0" w:val="nil"/>
+          <w:insideH w:color="000000" w:space="0" w:sz="0" w:val="nil"/>
+          <w:insideV w:color="000000" w:space="0" w:sz="0" w:val="nil"/>
         </w:tblBorders>
         <w:tblLayout w:type="fixed"/>
         <w:tblLook w:val="0600"/>
       </w:tblPr>
       <w:tblGrid>
-        <w:gridCol w:w="2520"/>
-        <w:gridCol w:w="2580"/>
-        <w:gridCol w:w="2625"/>
-        <w:gridCol w:w="1215"/>
+        <w:gridCol w:w="1770"/>
+        <w:gridCol w:w="3030"/>
+        <w:gridCol w:w="1140"/>
+        <w:gridCol w:w="2010"/>
+        <w:gridCol w:w="1320"/>
         <w:tblGridChange w:id="0">
           <w:tblGrid>
-            <w:gridCol w:w="2520"/>
-            <w:gridCol w:w="2580"/>
-            <w:gridCol w:w="2625"/>
-            <w:gridCol w:w="1215"/>
+            <w:gridCol w:w="1770"/>
+            <w:gridCol w:w="3030"/>
+            <w:gridCol w:w="1140"/>
+            <w:gridCol w:w="2010"/>
+            <w:gridCol w:w="1320"/>
           </w:tblGrid>
         </w:tblGridChange>
       </w:tblGrid>
       <w:tr>
         <w:trPr>
           <w:cantSplit w:val="0"/>
+          <w:trHeight w:val="330" w:hRule="atLeast"/>
           <w:tblHeader w:val="0"/>
         </w:trPr>
         <w:tc>
-          <w:tcPr/>
+          <w:tcPr>
+            <w:tcBorders>
+              <w:top w:color="cccccc" w:space="0" w:sz="5" w:val="single"/>
+              <w:left w:color="cccccc" w:space="0" w:sz="5" w:val="single"/>
+              <w:bottom w:color="cccccc" w:space="0" w:sz="5" w:val="single"/>
+              <w:right w:color="cccccc" w:space="0" w:sz="5" w:val="single"/>
+            </w:tcBorders>
+            <w:tcMar>
+              <w:top w:w="40.0" w:type="dxa"/>
+              <w:left w:w="40.0" w:type="dxa"/>
+              <w:bottom w:w="40.0" w:type="dxa"/>
+              <w:right w:w="40.0" w:type="dxa"/>
+            </w:tcMar>
+            <w:vAlign w:val="bottom"/>
+          </w:tcPr>
           <w:p>
             <w:pPr>
               <w:widowControl w:val="0"/>
-              <w:spacing w:line="240" w:lineRule="auto"/>
+              <w:spacing w:line="276" w:lineRule="auto"/>
               <w:ind w:left="0" w:firstLine="0"/>
               <w:rPr>
-                <w:rFonts w:ascii="Ubuntu" w:cs="Ubuntu" w:eastAsia="Ubuntu" w:hAnsi="Ubuntu"/>
                 <w:b w:val="1"/>
                 <w:bCs w:val="1"/>
               </w:rPr>
             </w:pPr>
             <w:r>
               <w:rPr>
-                <w:rFonts w:ascii="Ubuntu" w:cs="Ubuntu" w:eastAsia="Ubuntu" w:hAnsi="Ubuntu"/>
                 <w:b w:val="1"/>
                 <w:bCs w:val="1"/>
                 <w:rtl w:val="0"/>
               </w:rPr>
               <w:t xml:space="preserve">Item</w:t>
             </w:r>
-            <w:r>
-              <w:rPr>
-                <w:rtl w:val="0"/>
-              </w:rPr>
-            </w:r>
-          </w:p>
-        </w:tc>
-        <w:tc>
-          <w:tcPr/>
+          </w:p>
+        </w:tc>
+        <w:tc>
+          <w:tcPr>
+            <w:tcBorders>
+              <w:top w:color="cccccc" w:space="0" w:sz="5" w:val="single"/>
+              <w:left w:color="cccccc" w:space="0" w:sz="5" w:val="single"/>
+              <w:bottom w:color="cccccc" w:space="0" w:sz="5" w:val="single"/>
+              <w:right w:color="cccccc" w:space="0" w:sz="5" w:val="single"/>
+            </w:tcBorders>
+            <w:tcMar>
+              <w:top w:w="40.0" w:type="dxa"/>
+              <w:left w:w="40.0" w:type="dxa"/>
+              <w:bottom w:w="40.0" w:type="dxa"/>
+              <w:right w:w="40.0" w:type="dxa"/>
+            </w:tcMar>
+            <w:vAlign w:val="bottom"/>
+          </w:tcPr>
           <w:p>
             <w:pPr>
               <w:widowControl w:val="0"/>
-              <w:spacing w:line="240" w:lineRule="auto"/>
+              <w:spacing w:line="276" w:lineRule="auto"/>
               <w:ind w:left="0" w:firstLine="0"/>
               <w:rPr>
-                <w:rFonts w:ascii="Ubuntu" w:cs="Ubuntu" w:eastAsia="Ubuntu" w:hAnsi="Ubuntu"/>
                 <w:b w:val="1"/>
                 <w:bCs w:val="1"/>
               </w:rPr>
             </w:pPr>
             <w:r>
               <w:rPr>
-                <w:rFonts w:ascii="Ubuntu" w:cs="Ubuntu" w:eastAsia="Ubuntu" w:hAnsi="Ubuntu"/>
                 <w:b w:val="1"/>
                 <w:bCs w:val="1"/>
                 <w:rtl w:val="0"/>
@@ -2305,45 +2308,105 @@
           </w:p>
         </w:tc>
         <w:tc>
-          <w:tcPr/>
+          <w:tcPr>
+            <w:tcBorders>
+              <w:top w:color="cccccc" w:space="0" w:sz="5" w:val="single"/>
+              <w:left w:color="cccccc" w:space="0" w:sz="5" w:val="single"/>
+              <w:bottom w:color="cccccc" w:space="0" w:sz="5" w:val="single"/>
+              <w:right w:color="cccccc" w:space="0" w:sz="5" w:val="single"/>
+            </w:tcBorders>
+            <w:tcMar>
+              <w:top w:w="40.0" w:type="dxa"/>
+              <w:left w:w="40.0" w:type="dxa"/>
+              <w:bottom w:w="40.0" w:type="dxa"/>
+              <w:right w:w="40.0" w:type="dxa"/>
+            </w:tcMar>
+            <w:vAlign w:val="bottom"/>
+          </w:tcPr>
           <w:p>
             <w:pPr>
               <w:widowControl w:val="0"/>
-              <w:spacing w:line="240" w:lineRule="auto"/>
+              <w:spacing w:line="276" w:lineRule="auto"/>
               <w:ind w:left="0" w:firstLine="0"/>
               <w:rPr>
-                <w:rFonts w:ascii="Ubuntu" w:cs="Ubuntu" w:eastAsia="Ubuntu" w:hAnsi="Ubuntu"/>
                 <w:b w:val="1"/>
                 <w:bCs w:val="1"/>
               </w:rPr>
             </w:pPr>
             <w:r>
               <w:rPr>
-                <w:rFonts w:ascii="Ubuntu" w:cs="Ubuntu" w:eastAsia="Ubuntu" w:hAnsi="Ubuntu"/>
                 <w:b w:val="1"/>
                 <w:bCs w:val="1"/>
                 <w:rtl w:val="0"/>
               </w:rPr>
-              <w:t xml:space="preserve">Price</w:t>
-            </w:r>
-          </w:p>
-        </w:tc>
-        <w:tc>
-          <w:tcPr/>
+              <w:t xml:space="preserve">Supplier</w:t>
+            </w:r>
+          </w:p>
+        </w:tc>
+        <w:tc>
+          <w:tcPr>
+            <w:tcBorders>
+              <w:top w:color="cccccc" w:space="0" w:sz="5" w:val="single"/>
+              <w:left w:color="cccccc" w:space="0" w:sz="5" w:val="single"/>
+              <w:bottom w:color="cccccc" w:space="0" w:sz="5" w:val="single"/>
+              <w:right w:color="cccccc" w:space="0" w:sz="5" w:val="single"/>
+            </w:tcBorders>
+            <w:tcMar>
+              <w:top w:w="40.0" w:type="dxa"/>
+              <w:left w:w="40.0" w:type="dxa"/>
+              <w:bottom w:w="40.0" w:type="dxa"/>
+              <w:right w:w="40.0" w:type="dxa"/>
+            </w:tcMar>
+            <w:vAlign w:val="bottom"/>
+          </w:tcPr>
           <w:p>
             <w:pPr>
               <w:widowControl w:val="0"/>
-              <w:spacing w:line="240" w:lineRule="auto"/>
+              <w:spacing w:line="276" w:lineRule="auto"/>
               <w:ind w:left="0" w:firstLine="0"/>
               <w:rPr>
-                <w:rFonts w:ascii="Ubuntu" w:cs="Ubuntu" w:eastAsia="Ubuntu" w:hAnsi="Ubuntu"/>
                 <w:b w:val="1"/>
                 <w:bCs w:val="1"/>
               </w:rPr>
             </w:pPr>
             <w:r>
               <w:rPr>
-                <w:rFonts w:ascii="Ubuntu" w:cs="Ubuntu" w:eastAsia="Ubuntu" w:hAnsi="Ubuntu"/>
+                <w:b w:val="1"/>
+                <w:bCs w:val="1"/>
+                <w:rtl w:val="0"/>
+              </w:rPr>
+              <w:t xml:space="preserve">Price</w:t>
+            </w:r>
+          </w:p>
+        </w:tc>
+        <w:tc>
+          <w:tcPr>
+            <w:tcBorders>
+              <w:top w:color="cccccc" w:space="0" w:sz="5" w:val="single"/>
+              <w:left w:color="cccccc" w:space="0" w:sz="5" w:val="single"/>
+              <w:bottom w:color="cccccc" w:space="0" w:sz="5" w:val="single"/>
+              <w:right w:color="cccccc" w:space="0" w:sz="5" w:val="single"/>
+            </w:tcBorders>
+            <w:tcMar>
+              <w:top w:w="40.0" w:type="dxa"/>
+              <w:left w:w="40.0" w:type="dxa"/>
+              <w:bottom w:w="40.0" w:type="dxa"/>
+              <w:right w:w="40.0" w:type="dxa"/>
+            </w:tcMar>
+            <w:vAlign w:val="bottom"/>
+          </w:tcPr>
+          <w:p>
+            <w:pPr>
+              <w:widowControl w:val="0"/>
+              <w:spacing w:line="276" w:lineRule="auto"/>
+              <w:ind w:left="0" w:firstLine="0"/>
+              <w:rPr>
+                <w:b w:val="1"/>
+                <w:bCs w:val="1"/>
+              </w:rPr>
+            </w:pPr>
+            <w:r>
+              <w:rPr>
                 <w:b w:val="1"/>
                 <w:bCs w:val="1"/>
                 <w:rtl w:val="0"/>
@@ -2356,18 +2419,39 @@
       <w:tr>
         <w:trPr>
           <w:cantSplit w:val="0"/>
+          <w:trHeight w:val="330" w:hRule="atLeast"/>
           <w:tblHeader w:val="0"/>
         </w:trPr>
         <w:tc>
-          <w:tcPr/>
-          <w:p>
-            <w:pPr>
-              <w:spacing w:line="240" w:lineRule="auto"/>
+          <w:tcPr>
+            <w:tcBorders>
+              <w:top w:color="cccccc" w:space="0" w:sz="5" w:val="single"/>
+              <w:left w:color="cccccc" w:space="0" w:sz="5" w:val="single"/>
+              <w:bottom w:color="cccccc" w:space="0" w:sz="5" w:val="single"/>
+              <w:right w:color="cccccc" w:space="0" w:sz="5" w:val="single"/>
+            </w:tcBorders>
+            <w:tcMar>
+              <w:top w:w="40.0" w:type="dxa"/>
+              <w:left w:w="40.0" w:type="dxa"/>
+              <w:bottom w:w="40.0" w:type="dxa"/>
+              <w:right w:w="40.0" w:type="dxa"/>
+            </w:tcMar>
+            <w:vAlign w:val="bottom"/>
+          </w:tcPr>
+          <w:p>
+            <w:pPr>
+              <w:widowControl w:val="0"/>
+              <w:spacing w:line="276" w:lineRule="auto"/>
               <w:ind w:left="0" w:firstLine="0"/>
-              <w:rPr/>
-            </w:pPr>
-            <w:r>
-              <w:rPr>
+              <w:rPr>
+                <w:b w:val="1"/>
+                <w:bCs w:val="1"/>
+              </w:rPr>
+            </w:pPr>
+            <w:r>
+              <w:rPr>
+                <w:b w:val="1"/>
+                <w:bCs w:val="1"/>
                 <w:rtl w:val="0"/>
               </w:rPr>
               <w:t xml:space="preserve">Pet Button</w:t>
@@ -2375,11 +2459,25 @@
           </w:p>
         </w:tc>
         <w:tc>
-          <w:tcPr/>
+          <w:tcPr>
+            <w:tcBorders>
+              <w:top w:color="cccccc" w:space="0" w:sz="5" w:val="single"/>
+              <w:left w:color="cccccc" w:space="0" w:sz="5" w:val="single"/>
+              <w:bottom w:color="cccccc" w:space="0" w:sz="5" w:val="single"/>
+              <w:right w:color="cccccc" w:space="0" w:sz="5" w:val="single"/>
+            </w:tcBorders>
+            <w:tcMar>
+              <w:top w:w="40.0" w:type="dxa"/>
+              <w:left w:w="40.0" w:type="dxa"/>
+              <w:bottom w:w="40.0" w:type="dxa"/>
+              <w:right w:w="40.0" w:type="dxa"/>
+            </w:tcMar>
+            <w:vAlign w:val="bottom"/>
+          </w:tcPr>
           <w:p>
             <w:pPr>
               <w:widowControl w:val="0"/>
-              <w:spacing w:line="240" w:lineRule="auto"/>
+              <w:spacing w:line="276" w:lineRule="auto"/>
               <w:ind w:left="0" w:firstLine="0"/>
               <w:rPr/>
             </w:pPr>
@@ -2390,22 +2488,175 @@
                   <w:u w:val="single"/>
                   <w:rtl w:val="0"/>
                 </w:rPr>
-                <w:t xml:space="preserve">Click Here</w:t>
+                <w:t xml:space="preserve">https://s.lazada.sg/s.2TC3e</w:t>
               </w:r>
             </w:hyperlink>
             <w:r>
               <w:rPr>
                 <w:rtl w:val="0"/>
               </w:rPr>
-              <w:t xml:space="preserve"> </w:t>
-            </w:r>
-            <w:r>
-              <w:rPr>
-                <w:rtl w:val="0"/>
-              </w:rPr>
-              <w:t xml:space="preserve">Shoppe link - Link too long</w:t>
-              <w:br w:type="textWrapping"/>
-            </w:r>
+            </w:r>
+          </w:p>
+        </w:tc>
+        <w:tc>
+          <w:tcPr>
+            <w:tcBorders>
+              <w:top w:color="cccccc" w:space="0" w:sz="5" w:val="single"/>
+              <w:left w:color="cccccc" w:space="0" w:sz="5" w:val="single"/>
+              <w:bottom w:color="cccccc" w:space="0" w:sz="5" w:val="single"/>
+              <w:right w:color="cccccc" w:space="0" w:sz="5" w:val="single"/>
+            </w:tcBorders>
+            <w:tcMar>
+              <w:top w:w="40.0" w:type="dxa"/>
+              <w:left w:w="40.0" w:type="dxa"/>
+              <w:bottom w:w="40.0" w:type="dxa"/>
+              <w:right w:w="40.0" w:type="dxa"/>
+            </w:tcMar>
+            <w:vAlign w:val="bottom"/>
+          </w:tcPr>
+          <w:p>
+            <w:pPr>
+              <w:widowControl w:val="0"/>
+              <w:spacing w:line="276" w:lineRule="auto"/>
+              <w:ind w:left="0" w:firstLine="0"/>
+              <w:rPr/>
+            </w:pPr>
+            <w:r>
+              <w:rPr>
+                <w:rtl w:val="0"/>
+              </w:rPr>
+              <w:t xml:space="preserve">Lazada</w:t>
+            </w:r>
+          </w:p>
+        </w:tc>
+        <w:tc>
+          <w:tcPr>
+            <w:tcBorders>
+              <w:top w:color="cccccc" w:space="0" w:sz="5" w:val="single"/>
+              <w:left w:color="cccccc" w:space="0" w:sz="5" w:val="single"/>
+              <w:bottom w:color="cccccc" w:space="0" w:sz="5" w:val="single"/>
+              <w:right w:color="cccccc" w:space="0" w:sz="5" w:val="single"/>
+            </w:tcBorders>
+            <w:tcMar>
+              <w:top w:w="40.0" w:type="dxa"/>
+              <w:left w:w="40.0" w:type="dxa"/>
+              <w:bottom w:w="40.0" w:type="dxa"/>
+              <w:right w:w="40.0" w:type="dxa"/>
+            </w:tcMar>
+            <w:vAlign w:val="bottom"/>
+          </w:tcPr>
+          <w:p>
+            <w:pPr>
+              <w:widowControl w:val="0"/>
+              <w:spacing w:line="276" w:lineRule="auto"/>
+              <w:ind w:left="0" w:firstLine="0"/>
+              <w:rPr/>
+            </w:pPr>
+            <w:r>
+              <w:rPr>
+                <w:rtl w:val="0"/>
+              </w:rPr>
+              <w:t xml:space="preserve">5.50 SGD/pcs</w:t>
+            </w:r>
+          </w:p>
+        </w:tc>
+        <w:tc>
+          <w:tcPr>
+            <w:tcBorders>
+              <w:top w:color="cccccc" w:space="0" w:sz="5" w:val="single"/>
+              <w:left w:color="cccccc" w:space="0" w:sz="5" w:val="single"/>
+              <w:bottom w:color="cccccc" w:space="0" w:sz="5" w:val="single"/>
+              <w:right w:color="cccccc" w:space="0" w:sz="5" w:val="single"/>
+            </w:tcBorders>
+            <w:tcMar>
+              <w:top w:w="40.0" w:type="dxa"/>
+              <w:left w:w="40.0" w:type="dxa"/>
+              <w:bottom w:w="40.0" w:type="dxa"/>
+              <w:right w:w="40.0" w:type="dxa"/>
+            </w:tcMar>
+            <w:vAlign w:val="bottom"/>
+          </w:tcPr>
+          <w:p>
+            <w:pPr>
+              <w:widowControl w:val="0"/>
+              <w:spacing w:line="276" w:lineRule="auto"/>
+              <w:ind w:left="0" w:firstLine="0"/>
+              <w:rPr/>
+            </w:pPr>
+            <w:r>
+              <w:rPr>
+                <w:rtl w:val="0"/>
+              </w:rPr>
+              <w:t xml:space="preserve">1</w:t>
+            </w:r>
+          </w:p>
+        </w:tc>
+      </w:tr>
+      <w:tr>
+        <w:trPr>
+          <w:cantSplit w:val="0"/>
+          <w:trHeight w:val="330" w:hRule="atLeast"/>
+          <w:tblHeader w:val="0"/>
+        </w:trPr>
+        <w:tc>
+          <w:tcPr>
+            <w:tcBorders>
+              <w:top w:color="cccccc" w:space="0" w:sz="5" w:val="single"/>
+              <w:left w:color="cccccc" w:space="0" w:sz="5" w:val="single"/>
+              <w:bottom w:color="cccccc" w:space="0" w:sz="5" w:val="single"/>
+              <w:right w:color="cccccc" w:space="0" w:sz="5" w:val="single"/>
+            </w:tcBorders>
+            <w:tcMar>
+              <w:top w:w="40.0" w:type="dxa"/>
+              <w:left w:w="40.0" w:type="dxa"/>
+              <w:bottom w:w="40.0" w:type="dxa"/>
+              <w:right w:w="40.0" w:type="dxa"/>
+            </w:tcMar>
+            <w:vAlign w:val="bottom"/>
+          </w:tcPr>
+          <w:p>
+            <w:pPr>
+              <w:widowControl w:val="0"/>
+              <w:spacing w:line="276" w:lineRule="auto"/>
+              <w:ind w:left="0" w:firstLine="0"/>
+              <w:rPr>
+                <w:b w:val="1"/>
+                <w:bCs w:val="1"/>
+              </w:rPr>
+            </w:pPr>
+            <w:r>
+              <w:rPr>
+                <w:b w:val="1"/>
+                <w:bCs w:val="1"/>
+                <w:rtl w:val="0"/>
+              </w:rPr>
+              <w:t xml:space="preserve">Push button 12*12*4.3 or 5</w:t>
+            </w:r>
+          </w:p>
+        </w:tc>
+        <w:tc>
+          <w:tcPr>
+            <w:tcBorders>
+              <w:top w:color="cccccc" w:space="0" w:sz="5" w:val="single"/>
+              <w:left w:color="cccccc" w:space="0" w:sz="5" w:val="single"/>
+              <w:bottom w:color="cccccc" w:space="0" w:sz="5" w:val="single"/>
+              <w:right w:color="cccccc" w:space="0" w:sz="5" w:val="single"/>
+            </w:tcBorders>
+            <w:tcMar>
+              <w:top w:w="40.0" w:type="dxa"/>
+              <w:left w:w="40.0" w:type="dxa"/>
+              <w:bottom w:w="40.0" w:type="dxa"/>
+              <w:right w:w="40.0" w:type="dxa"/>
+            </w:tcMar>
+            <w:vAlign w:val="bottom"/>
+          </w:tcPr>
+          <w:p>
+            <w:pPr>
+              <w:widowControl w:val="0"/>
+              <w:spacing w:line="276" w:lineRule="auto"/>
+              <w:ind w:left="0" w:firstLine="0"/>
+              <w:rPr/>
+            </w:pPr>
             <w:hyperlink r:id="rId12">
               <w:r>
                 <w:rPr>
@@ -2413,23 +2664,36 @@
                   <w:u w:val="single"/>
                   <w:rtl w:val="0"/>
                 </w:rPr>
-                <w:t xml:space="preserve">Click Here</w:t>
+                <w:t xml:space="preserve">https://sg.shp.ee/5rWgzCj</w:t>
               </w:r>
             </w:hyperlink>
             <w:r>
               <w:rPr>
                 <w:rtl w:val="0"/>
               </w:rPr>
-              <w:t xml:space="preserve"> Lazada Link - Link too long</w:t>
-            </w:r>
-          </w:p>
-        </w:tc>
-        <w:tc>
-          <w:tcPr/>
+            </w:r>
+          </w:p>
+        </w:tc>
+        <w:tc>
+          <w:tcPr>
+            <w:tcBorders>
+              <w:top w:color="cccccc" w:space="0" w:sz="5" w:val="single"/>
+              <w:left w:color="cccccc" w:space="0" w:sz="5" w:val="single"/>
+              <w:bottom w:color="cccccc" w:space="0" w:sz="5" w:val="single"/>
+              <w:right w:color="cccccc" w:space="0" w:sz="5" w:val="single"/>
+            </w:tcBorders>
+            <w:tcMar>
+              <w:top w:w="40.0" w:type="dxa"/>
+              <w:left w:w="40.0" w:type="dxa"/>
+              <w:bottom w:w="40.0" w:type="dxa"/>
+              <w:right w:w="40.0" w:type="dxa"/>
+            </w:tcMar>
+            <w:vAlign w:val="bottom"/>
+          </w:tcPr>
           <w:p>
             <w:pPr>
               <w:widowControl w:val="0"/>
-              <w:spacing w:line="240" w:lineRule="auto"/>
+              <w:spacing w:line="276" w:lineRule="auto"/>
               <w:ind w:left="0" w:firstLine="0"/>
               <w:rPr/>
             </w:pPr>
@@ -2437,13 +2701,30 @@
               <w:rPr>
                 <w:rtl w:val="0"/>
               </w:rPr>
-              <w:t xml:space="preserve">5.86 SGD/pcs or </w:t>
-            </w:r>
-          </w:p>
+              <w:t xml:space="preserve">Shopee</w:t>
+            </w:r>
+          </w:p>
+        </w:tc>
+        <w:tc>
+          <w:tcPr>
+            <w:tcBorders>
+              <w:top w:color="cccccc" w:space="0" w:sz="5" w:val="single"/>
+              <w:left w:color="cccccc" w:space="0" w:sz="5" w:val="single"/>
+              <w:bottom w:color="cccccc" w:space="0" w:sz="5" w:val="single"/>
+              <w:right w:color="cccccc" w:space="0" w:sz="5" w:val="single"/>
+            </w:tcBorders>
+            <w:tcMar>
+              <w:top w:w="40.0" w:type="dxa"/>
+              <w:left w:w="40.0" w:type="dxa"/>
+              <w:bottom w:w="40.0" w:type="dxa"/>
+              <w:right w:w="40.0" w:type="dxa"/>
+            </w:tcMar>
+            <w:vAlign w:val="bottom"/>
+          </w:tcPr>
           <w:p>
             <w:pPr>
               <w:widowControl w:val="0"/>
-              <w:spacing w:line="240" w:lineRule="auto"/>
+              <w:spacing w:line="276" w:lineRule="auto"/>
               <w:ind w:left="0" w:firstLine="0"/>
               <w:rPr/>
             </w:pPr>
@@ -2451,16 +2732,31 @@
               <w:rPr>
                 <w:rtl w:val="0"/>
               </w:rPr>
-              <w:t xml:space="preserve">5.50 SGD/pcs</w:t>
-            </w:r>
-          </w:p>
-        </w:tc>
-        <w:tc>
-          <w:tcPr/>
+              <w:t xml:space="preserve">4.26 SGD/30pcs</w:t>
+            </w:r>
+          </w:p>
+        </w:tc>
+        <w:tc>
+          <w:tcPr>
+            <w:tcBorders>
+              <w:top w:color="cccccc" w:space="0" w:sz="5" w:val="single"/>
+              <w:left w:color="cccccc" w:space="0" w:sz="5" w:val="single"/>
+              <w:bottom w:color="cccccc" w:space="0" w:sz="5" w:val="single"/>
+              <w:right w:color="cccccc" w:space="0" w:sz="5" w:val="single"/>
+            </w:tcBorders>
+            <w:tcMar>
+              <w:top w:w="40.0" w:type="dxa"/>
+              <w:left w:w="40.0" w:type="dxa"/>
+              <w:bottom w:w="40.0" w:type="dxa"/>
+              <w:right w:w="40.0" w:type="dxa"/>
+            </w:tcMar>
+            <w:vAlign w:val="bottom"/>
+          </w:tcPr>
           <w:p>
             <w:pPr>
               <w:widowControl w:val="0"/>
-              <w:spacing w:line="240" w:lineRule="auto"/>
+              <w:spacing w:line="276" w:lineRule="auto"/>
+              <w:ind w:left="0" w:firstLine="0"/>
               <w:rPr/>
             </w:pPr>
             <w:r>
@@ -2475,31 +2771,65 @@
       <w:tr>
         <w:trPr>
           <w:cantSplit w:val="0"/>
+          <w:trHeight w:val="330" w:hRule="atLeast"/>
           <w:tblHeader w:val="0"/>
         </w:trPr>
         <w:tc>
-          <w:tcPr/>
+          <w:tcPr>
+            <w:tcBorders>
+              <w:top w:color="cccccc" w:space="0" w:sz="5" w:val="single"/>
+              <w:left w:color="cccccc" w:space="0" w:sz="5" w:val="single"/>
+              <w:bottom w:color="cccccc" w:space="0" w:sz="5" w:val="single"/>
+              <w:right w:color="cccccc" w:space="0" w:sz="5" w:val="single"/>
+            </w:tcBorders>
+            <w:tcMar>
+              <w:top w:w="40.0" w:type="dxa"/>
+              <w:left w:w="40.0" w:type="dxa"/>
+              <w:bottom w:w="40.0" w:type="dxa"/>
+              <w:right w:w="40.0" w:type="dxa"/>
+            </w:tcMar>
+            <w:vAlign w:val="bottom"/>
+          </w:tcPr>
           <w:p>
             <w:pPr>
               <w:widowControl w:val="0"/>
-              <w:spacing w:line="240" w:lineRule="auto"/>
+              <w:spacing w:line="276" w:lineRule="auto"/>
               <w:ind w:left="0" w:firstLine="0"/>
-              <w:rPr/>
-            </w:pPr>
-            <w:r>
-              <w:rPr>
-                <w:rtl w:val="0"/>
-              </w:rPr>
-              <w:t xml:space="preserve">Push button 12*12*4.3 or 5</w:t>
-            </w:r>
-          </w:p>
-        </w:tc>
-        <w:tc>
-          <w:tcPr/>
+              <w:rPr>
+                <w:b w:val="1"/>
+                <w:bCs w:val="1"/>
+              </w:rPr>
+            </w:pPr>
+            <w:r>
+              <w:rPr>
+                <w:b w:val="1"/>
+                <w:bCs w:val="1"/>
+                <w:rtl w:val="0"/>
+              </w:rPr>
+              <w:t xml:space="preserve">3.5mm male mono audio jack cable</w:t>
+            </w:r>
+          </w:p>
+        </w:tc>
+        <w:tc>
+          <w:tcPr>
+            <w:tcBorders>
+              <w:top w:color="cccccc" w:space="0" w:sz="5" w:val="single"/>
+              <w:left w:color="cccccc" w:space="0" w:sz="5" w:val="single"/>
+              <w:bottom w:color="cccccc" w:space="0" w:sz="5" w:val="single"/>
+              <w:right w:color="cccccc" w:space="0" w:sz="5" w:val="single"/>
+            </w:tcBorders>
+            <w:tcMar>
+              <w:top w:w="40.0" w:type="dxa"/>
+              <w:left w:w="40.0" w:type="dxa"/>
+              <w:bottom w:w="40.0" w:type="dxa"/>
+              <w:right w:w="40.0" w:type="dxa"/>
+            </w:tcMar>
+            <w:vAlign w:val="bottom"/>
+          </w:tcPr>
           <w:p>
             <w:pPr>
               <w:widowControl w:val="0"/>
-              <w:spacing w:line="240" w:lineRule="auto"/>
+              <w:spacing w:line="276" w:lineRule="auto"/>
               <w:ind w:left="0" w:firstLine="0"/>
               <w:rPr/>
             </w:pPr>
@@ -2510,23 +2840,36 @@
                   <w:u w:val="single"/>
                   <w:rtl w:val="0"/>
                 </w:rPr>
-                <w:t xml:space="preserve">Click Here </w:t>
+                <w:t xml:space="preserve">https://sg.shp.ee/XMNCs5N</w:t>
               </w:r>
             </w:hyperlink>
             <w:r>
               <w:rPr>
                 <w:rtl w:val="0"/>
               </w:rPr>
-              <w:t xml:space="preserve">- Link too long</w:t>
-            </w:r>
-          </w:p>
-        </w:tc>
-        <w:tc>
-          <w:tcPr/>
+            </w:r>
+          </w:p>
+        </w:tc>
+        <w:tc>
+          <w:tcPr>
+            <w:tcBorders>
+              <w:top w:color="cccccc" w:space="0" w:sz="5" w:val="single"/>
+              <w:left w:color="cccccc" w:space="0" w:sz="5" w:val="single"/>
+              <w:bottom w:color="cccccc" w:space="0" w:sz="5" w:val="single"/>
+              <w:right w:color="cccccc" w:space="0" w:sz="5" w:val="single"/>
+            </w:tcBorders>
+            <w:tcMar>
+              <w:top w:w="40.0" w:type="dxa"/>
+              <w:left w:w="40.0" w:type="dxa"/>
+              <w:bottom w:w="40.0" w:type="dxa"/>
+              <w:right w:w="40.0" w:type="dxa"/>
+            </w:tcMar>
+            <w:vAlign w:val="bottom"/>
+          </w:tcPr>
           <w:p>
             <w:pPr>
               <w:widowControl w:val="0"/>
-              <w:spacing w:line="240" w:lineRule="auto"/>
+              <w:spacing w:line="276" w:lineRule="auto"/>
               <w:ind w:left="0" w:firstLine="0"/>
               <w:rPr/>
             </w:pPr>
@@ -2534,16 +2877,62 @@
               <w:rPr>
                 <w:rtl w:val="0"/>
               </w:rPr>
-              <w:t xml:space="preserve">4.26 SGD/30pcs</w:t>
-            </w:r>
-          </w:p>
-        </w:tc>
-        <w:tc>
-          <w:tcPr/>
+              <w:t xml:space="preserve">Shopee</w:t>
+            </w:r>
+          </w:p>
+        </w:tc>
+        <w:tc>
+          <w:tcPr>
+            <w:tcBorders>
+              <w:top w:color="cccccc" w:space="0" w:sz="5" w:val="single"/>
+              <w:left w:color="cccccc" w:space="0" w:sz="5" w:val="single"/>
+              <w:bottom w:color="cccccc" w:space="0" w:sz="5" w:val="single"/>
+              <w:right w:color="cccccc" w:space="0" w:sz="5" w:val="single"/>
+            </w:tcBorders>
+            <w:tcMar>
+              <w:top w:w="40.0" w:type="dxa"/>
+              <w:left w:w="40.0" w:type="dxa"/>
+              <w:bottom w:w="40.0" w:type="dxa"/>
+              <w:right w:w="40.0" w:type="dxa"/>
+            </w:tcMar>
+            <w:vAlign w:val="bottom"/>
+          </w:tcPr>
           <w:p>
             <w:pPr>
               <w:widowControl w:val="0"/>
-              <w:spacing w:line="240" w:lineRule="auto"/>
+              <w:spacing w:line="276" w:lineRule="auto"/>
+              <w:ind w:left="0" w:firstLine="0"/>
+              <w:rPr/>
+            </w:pPr>
+            <w:r>
+              <w:rPr>
+                <w:rtl w:val="0"/>
+              </w:rPr>
+              <w:t xml:space="preserve">5.42 SGD/10pcs</w:t>
+            </w:r>
+          </w:p>
+        </w:tc>
+        <w:tc>
+          <w:tcPr>
+            <w:tcBorders>
+              <w:top w:color="cccccc" w:space="0" w:sz="5" w:val="single"/>
+              <w:left w:color="cccccc" w:space="0" w:sz="5" w:val="single"/>
+              <w:bottom w:color="cccccc" w:space="0" w:sz="5" w:val="single"/>
+              <w:right w:color="cccccc" w:space="0" w:sz="5" w:val="single"/>
+            </w:tcBorders>
+            <w:tcMar>
+              <w:top w:w="40.0" w:type="dxa"/>
+              <w:left w:w="40.0" w:type="dxa"/>
+              <w:bottom w:w="40.0" w:type="dxa"/>
+              <w:right w:w="40.0" w:type="dxa"/>
+            </w:tcMar>
+            <w:vAlign w:val="bottom"/>
+          </w:tcPr>
+          <w:p>
+            <w:pPr>
+              <w:widowControl w:val="0"/>
+              <w:spacing w:line="276" w:lineRule="auto"/>
+              <w:ind w:left="0" w:firstLine="0"/>
               <w:rPr/>
             </w:pPr>
             <w:r>
@@ -2558,31 +2947,65 @@
       <w:tr>
         <w:trPr>
           <w:cantSplit w:val="0"/>
+          <w:trHeight w:val="330" w:hRule="atLeast"/>
           <w:tblHeader w:val="0"/>
         </w:trPr>
         <w:tc>
-          <w:tcPr/>
+          <w:tcPr>
+            <w:tcBorders>
+              <w:top w:color="cccccc" w:space="0" w:sz="5" w:val="single"/>
+              <w:left w:color="cccccc" w:space="0" w:sz="5" w:val="single"/>
+              <w:bottom w:color="cccccc" w:space="0" w:sz="5" w:val="single"/>
+              <w:right w:color="cccccc" w:space="0" w:sz="5" w:val="single"/>
+            </w:tcBorders>
+            <w:tcMar>
+              <w:top w:w="40.0" w:type="dxa"/>
+              <w:left w:w="40.0" w:type="dxa"/>
+              <w:bottom w:w="40.0" w:type="dxa"/>
+              <w:right w:w="40.0" w:type="dxa"/>
+            </w:tcMar>
+            <w:vAlign w:val="bottom"/>
+          </w:tcPr>
           <w:p>
             <w:pPr>
               <w:widowControl w:val="0"/>
-              <w:spacing w:line="240" w:lineRule="auto"/>
+              <w:spacing w:line="276" w:lineRule="auto"/>
               <w:ind w:left="0" w:firstLine="0"/>
-              <w:rPr/>
-            </w:pPr>
-            <w:r>
-              <w:rPr>
-                <w:rtl w:val="0"/>
-              </w:rPr>
-              <w:t xml:space="preserve">3.5mm male mono audio jack cable</w:t>
-            </w:r>
-          </w:p>
-        </w:tc>
-        <w:tc>
-          <w:tcPr/>
+              <w:rPr>
+                <w:b w:val="1"/>
+                <w:bCs w:val="1"/>
+              </w:rPr>
+            </w:pPr>
+            <w:r>
+              <w:rPr>
+                <w:b w:val="1"/>
+                <w:bCs w:val="1"/>
+                <w:rtl w:val="0"/>
+              </w:rPr>
+              <w:t xml:space="preserve">Cable Tie 3x100mm</w:t>
+            </w:r>
+          </w:p>
+        </w:tc>
+        <w:tc>
+          <w:tcPr>
+            <w:tcBorders>
+              <w:top w:color="cccccc" w:space="0" w:sz="5" w:val="single"/>
+              <w:left w:color="cccccc" w:space="0" w:sz="5" w:val="single"/>
+              <w:bottom w:color="cccccc" w:space="0" w:sz="5" w:val="single"/>
+              <w:right w:color="cccccc" w:space="0" w:sz="5" w:val="single"/>
+            </w:tcBorders>
+            <w:tcMar>
+              <w:top w:w="40.0" w:type="dxa"/>
+              <w:left w:w="40.0" w:type="dxa"/>
+              <w:bottom w:w="40.0" w:type="dxa"/>
+              <w:right w:w="40.0" w:type="dxa"/>
+            </w:tcMar>
+            <w:vAlign w:val="bottom"/>
+          </w:tcPr>
           <w:p>
             <w:pPr>
               <w:widowControl w:val="0"/>
-              <w:spacing w:line="240" w:lineRule="auto"/>
+              <w:spacing w:line="276" w:lineRule="auto"/>
               <w:ind w:left="0" w:firstLine="0"/>
               <w:rPr/>
             </w:pPr>
@@ -2593,23 +3016,36 @@
                   <w:u w:val="single"/>
                   <w:rtl w:val="0"/>
                 </w:rPr>
-                <w:t xml:space="preserve">Click Here</w:t>
+                <w:t xml:space="preserve">https://sg.shp.ee/rzqTJnm</w:t>
               </w:r>
             </w:hyperlink>
             <w:r>
               <w:rPr>
                 <w:rtl w:val="0"/>
               </w:rPr>
-              <w:t xml:space="preserve"> - Link too long</w:t>
-            </w:r>
-          </w:p>
-        </w:tc>
-        <w:tc>
-          <w:tcPr/>
+            </w:r>
+          </w:p>
+        </w:tc>
+        <w:tc>
+          <w:tcPr>
+            <w:tcBorders>
+              <w:top w:color="cccccc" w:space="0" w:sz="5" w:val="single"/>
+              <w:left w:color="cccccc" w:space="0" w:sz="5" w:val="single"/>
+              <w:bottom w:color="cccccc" w:space="0" w:sz="5" w:val="single"/>
+              <w:right w:color="cccccc" w:space="0" w:sz="5" w:val="single"/>
+            </w:tcBorders>
+            <w:tcMar>
+              <w:top w:w="40.0" w:type="dxa"/>
+              <w:left w:w="40.0" w:type="dxa"/>
+              <w:bottom w:w="40.0" w:type="dxa"/>
+              <w:right w:w="40.0" w:type="dxa"/>
+            </w:tcMar>
+            <w:vAlign w:val="bottom"/>
+          </w:tcPr>
           <w:p>
             <w:pPr>
               <w:widowControl w:val="0"/>
-              <w:spacing w:line="240" w:lineRule="auto"/>
+              <w:spacing w:line="276" w:lineRule="auto"/>
               <w:ind w:left="0" w:firstLine="0"/>
               <w:rPr/>
             </w:pPr>
@@ -2617,38 +3053,30 @@
               <w:rPr>
                 <w:rtl w:val="0"/>
               </w:rPr>
-              <w:t xml:space="preserve">5.42 SGD/10pcs</w:t>
-            </w:r>
-          </w:p>
-        </w:tc>
-        <w:tc>
-          <w:tcPr/>
+              <w:t xml:space="preserve">Shopee</w:t>
+            </w:r>
+          </w:p>
+        </w:tc>
+        <w:tc>
+          <w:tcPr>
+            <w:tcBorders>
+              <w:top w:color="cccccc" w:space="0" w:sz="5" w:val="single"/>
+              <w:left w:color="cccccc" w:space="0" w:sz="5" w:val="single"/>
+              <w:bottom w:color="cccccc" w:space="0" w:sz="5" w:val="single"/>
+              <w:right w:color="cccccc" w:space="0" w:sz="5" w:val="single"/>
+            </w:tcBorders>
+            <w:tcMar>
+              <w:top w:w="40.0" w:type="dxa"/>
+              <w:left w:w="40.0" w:type="dxa"/>
+              <w:bottom w:w="40.0" w:type="dxa"/>
+              <w:right w:w="40.0" w:type="dxa"/>
+            </w:tcMar>
+            <w:vAlign w:val="bottom"/>
+          </w:tcPr>
           <w:p>
             <w:pPr>
               <w:widowControl w:val="0"/>
-              <w:spacing w:line="240" w:lineRule="auto"/>
-              <w:rPr/>
-            </w:pPr>
-            <w:r>
-              <w:rPr>
-                <w:rtl w:val="0"/>
-              </w:rPr>
-              <w:t xml:space="preserve">1</w:t>
-            </w:r>
-          </w:p>
-        </w:tc>
-      </w:tr>
-      <w:tr>
-        <w:trPr>
-          <w:cantSplit w:val="0"/>
-          <w:tblHeader w:val="0"/>
-        </w:trPr>
-        <w:tc>
-          <w:tcPr/>
-          <w:p>
-            <w:pPr>
-              <w:widowControl w:val="0"/>
-              <w:spacing w:line="240" w:lineRule="auto"/>
+              <w:spacing w:line="276" w:lineRule="auto"/>
               <w:ind w:left="0" w:firstLine="0"/>
               <w:rPr/>
             </w:pPr>
@@ -2656,62 +3084,33 @@
               <w:rPr>
                 <w:rtl w:val="0"/>
               </w:rPr>
-              <w:t xml:space="preserve">Cable Tie 3x100mm</w:t>
-            </w:r>
-          </w:p>
-        </w:tc>
-        <w:tc>
-          <w:tcPr/>
+              <w:t xml:space="preserve">1.62 SGD/100pcs</w:t>
+            </w:r>
+          </w:p>
+        </w:tc>
+        <w:tc>
+          <w:tcPr>
+            <w:tcBorders>
+              <w:top w:color="cccccc" w:space="0" w:sz="5" w:val="single"/>
+              <w:left w:color="cccccc" w:space="0" w:sz="5" w:val="single"/>
+              <w:bottom w:color="cccccc" w:space="0" w:sz="5" w:val="single"/>
+              <w:right w:color="cccccc" w:space="0" w:sz="5" w:val="single"/>
+            </w:tcBorders>
+            <w:tcMar>
+              <w:top w:w="40.0" w:type="dxa"/>
+              <w:left w:w="40.0" w:type="dxa"/>
+              <w:bottom w:w="40.0" w:type="dxa"/>
+              <w:right w:w="40.0" w:type="dxa"/>
+            </w:tcMar>
+            <w:vAlign w:val="bottom"/>
+          </w:tcPr>
           <w:p>
             <w:pPr>
               <w:widowControl w:val="0"/>
-              <w:spacing w:line="240" w:lineRule="auto"/>
+              <w:spacing w:line="276" w:lineRule="auto"/>
               <w:ind w:left="0" w:firstLine="0"/>
               <w:rPr/>
             </w:pPr>
-            <w:hyperlink r:id="rId15">
-              <w:r>
-                <w:rPr>
-                  <w:color w:val="1155cc"/>
-                  <w:u w:val="single"/>
-                  <w:rtl w:val="0"/>
-                </w:rPr>
-                <w:t xml:space="preserve">Click Here</w:t>
-              </w:r>
-            </w:hyperlink>
-            <w:r>
-              <w:rPr>
-                <w:rtl w:val="0"/>
-              </w:rPr>
-              <w:t xml:space="preserve"> - Link too long</w:t>
-            </w:r>
-          </w:p>
-        </w:tc>
-        <w:tc>
-          <w:tcPr/>
-          <w:p>
-            <w:pPr>
-              <w:widowControl w:val="0"/>
-              <w:spacing w:line="240" w:lineRule="auto"/>
-              <w:ind w:left="0" w:firstLine="0"/>
-              <w:rPr/>
-            </w:pPr>
-            <w:r>
-              <w:rPr>
-                <w:rtl w:val="0"/>
-              </w:rPr>
-              <w:t xml:space="preserve">1.62 SGD/100pcs</w:t>
-            </w:r>
-          </w:p>
-        </w:tc>
-        <w:tc>
-          <w:tcPr/>
-          <w:p>
-            <w:pPr>
-              <w:widowControl w:val="0"/>
-              <w:spacing w:line="240" w:lineRule="auto"/>
-              <w:rPr/>
-            </w:pPr>
             <w:r>
               <w:rPr>
                 <w:rtl w:val="0"/>
@@ -2722,27 +3121,6 @@
         </w:tc>
       </w:tr>
     </w:tbl>
-    <w:p>
-      <w:pPr>
-        <w:spacing w:line="276" w:lineRule="auto"/>
-        <w:rPr/>
-      </w:pPr>
-      <w:r>
-        <w:rPr>
-          <w:rtl w:val="0"/>
-        </w:rPr>
-      </w:r>
-    </w:p>
-    <w:p>
-      <w:pPr>
-        <w:rPr/>
-      </w:pPr>
-      <w:r>
-        <w:rPr>
-          <w:rtl w:val="0"/>
-        </w:rPr>
-      </w:r>
-    </w:p>
     <w:p>
       <w:pPr>
         <w:rPr/>
@@ -2803,17 +3181,17 @@
           <wp:inline distB="114300" distT="114300" distL="114300" distR="114300">
             <wp:extent cx="5495925" cy="5808002"/>
             <wp:effectExtent b="0" l="0" r="0" t="0"/>
-            <wp:docPr id="8" name="image20.jpg"/>
+            <wp:docPr id="8" name="image11.jpg"/>
             <a:graphic>
               <a:graphicData uri="http://schemas.openxmlformats.org/drawingml/2006/picture">
                 <pic:pic>
                   <pic:nvPicPr>
-                    <pic:cNvPr id="0" name="image20.jpg"/>
+                    <pic:cNvPr id="0" name="image11.jpg"/>
                     <pic:cNvPicPr preferRelativeResize="0"/>
                   </pic:nvPicPr>
                   <pic:blipFill>
-                    <a:blip r:embed="rId16"/>
-                    <a:srcRect b="14288" l="0" r="0" t="26192"/>
+                    <a:blip r:embed="rId15"/>
+                    <a:srcRect b="14289" l="0" r="0" t="26193"/>
                     <a:stretch>
                       <a:fillRect/>
                     </a:stretch>
@@ -3001,17 +3379,17 @@
                 <wp:inline distB="114300" distT="114300" distL="114300" distR="114300">
                   <wp:extent cx="2781300" cy="1237404"/>
                   <wp:effectExtent b="0" l="0" r="0" t="0"/>
-                  <wp:docPr id="21" name="image17.jpg"/>
+                  <wp:docPr id="21" name="image9.jpg"/>
                   <a:graphic>
                     <a:graphicData uri="http://schemas.openxmlformats.org/drawingml/2006/picture">
                       <pic:pic>
                         <pic:nvPicPr>
-                          <pic:cNvPr id="0" name="image17.jpg"/>
+                          <pic:cNvPr id="0" name="image9.jpg"/>
                           <pic:cNvPicPr preferRelativeResize="0"/>
                         </pic:nvPicPr>
                         <pic:blipFill>
-                          <a:blip r:embed="rId17"/>
-                          <a:srcRect b="34507" l="0" r="0" t="40445"/>
+                          <a:blip r:embed="rId16"/>
+                          <a:srcRect b="34508" l="0" r="0" t="40445"/>
                           <a:stretch>
                             <a:fillRect/>
                           </a:stretch>
@@ -3104,7 +3482,7 @@
                                   <pic:cNvPicPr preferRelativeResize="0"/>
                                 </pic:nvPicPr>
                                 <pic:blipFill rotWithShape="1">
-                                  <a:blip r:embed="rId18">
+                                  <a:blip r:embed="rId17">
                                     <a:alphaModFix/>
                                   </a:blip>
                                   <a:srcRect b="35838" l="0" r="0" t="32370"/>
@@ -3174,16 +3552,16 @@
                     <wp:inline distB="114300" distT="114300" distL="114300" distR="114300">
                       <wp:extent cx="2781300" cy="1574800"/>
                       <wp:effectExtent b="0" l="0" r="0" t="0"/>
-                      <wp:docPr id="1" name="image6.png"/>
+                      <wp:docPr id="1" name="image2.png"/>
                       <a:graphic>
                         <a:graphicData uri="http://schemas.openxmlformats.org/drawingml/2006/picture">
                           <pic:pic>
                             <pic:nvPicPr>
-                              <pic:cNvPr id="0" name="image6.png"/>
+                              <pic:cNvPr id="0" name="image2.png"/>
                               <pic:cNvPicPr preferRelativeResize="0"/>
                             </pic:nvPicPr>
                             <pic:blipFill>
-                              <a:blip r:embed="rId19"/>
+                              <a:blip r:embed="rId18"/>
                               <a:srcRect/>
                               <a:stretch>
                                 <a:fillRect/>
@@ -3248,12 +3626,12 @@
                 <wp:inline distB="114300" distT="114300" distL="114300" distR="114300">
                   <wp:extent cx="2781300" cy="1022561"/>
                   <wp:effectExtent b="0" l="0" r="0" t="0"/>
-                  <wp:docPr id="14" name="image15.jpg"/>
+                  <wp:docPr id="14" name="image16.jpg"/>
                   <a:graphic>
                     <a:graphicData uri="http://schemas.openxmlformats.org/drawingml/2006/picture">
                       <pic:pic>
                         <pic:nvPicPr>
-                          <pic:cNvPr id="0" name="image15.jpg"/>
+                          <pic:cNvPr id="0" name="image16.jpg"/>
                           <pic:cNvPicPr preferRelativeResize="0"/>
                         </pic:nvPicPr>
                         <pic:blipFill>
@@ -3320,17 +3698,17 @@
                 <wp:inline distB="114300" distT="114300" distL="114300" distR="114300">
                   <wp:extent cx="2781300" cy="2552700"/>
                   <wp:effectExtent b="0" l="0" r="0" t="0"/>
-                  <wp:docPr id="13" name="image11.jpg"/>
+                  <wp:docPr id="13" name="image12.jpg"/>
                   <a:graphic>
                     <a:graphicData uri="http://schemas.openxmlformats.org/drawingml/2006/picture">
                       <pic:pic>
                         <pic:nvPicPr>
-                          <pic:cNvPr id="0" name="image11.jpg"/>
+                          <pic:cNvPr id="0" name="image12.jpg"/>
                           <pic:cNvPicPr preferRelativeResize="0"/>
                         </pic:nvPicPr>
                         <pic:blipFill>
                           <a:blip r:embed="rId10"/>
-                          <a:srcRect b="23170" l="0" r="0" t="25239"/>
+                          <a:srcRect b="23171" l="0" r="0" t="25240"/>
                           <a:stretch>
                             <a:fillRect/>
                           </a:stretch>
@@ -4068,16 +4446,16 @@
           <wp:inline distB="114300" distT="114300" distL="114300" distR="114300">
             <wp:extent cx="5734050" cy="6924675"/>
             <wp:effectExtent b="0" l="0" r="0" t="0"/>
-            <wp:docPr id="16" name="image13.jpg"/>
+            <wp:docPr id="16" name="image17.jpg"/>
             <a:graphic>
               <a:graphicData uri="http://schemas.openxmlformats.org/drawingml/2006/picture">
                 <pic:pic>
                   <pic:nvPicPr>
-                    <pic:cNvPr id="0" name="image13.jpg"/>
+                    <pic:cNvPr id="0" name="image17.jpg"/>
                     <pic:cNvPicPr preferRelativeResize="0"/>
                   </pic:nvPicPr>
                   <pic:blipFill>
-                    <a:blip r:embed="rId20"/>
+                    <a:blip r:embed="rId19"/>
                     <a:srcRect b="10477" l="0" r="0" t="21515"/>
                     <a:stretch>
                       <a:fillRect/>
@@ -4335,8 +4713,8 @@
                           <pic:cNvPicPr preferRelativeResize="0"/>
                         </pic:nvPicPr>
                         <pic:blipFill>
-                          <a:blip r:embed="rId21"/>
-                          <a:srcRect b="28888" l="0" r="0" t="40000"/>
+                          <a:blip r:embed="rId20"/>
+                          <a:srcRect b="28889" l="0" r="0" t="40001"/>
                           <a:stretch>
                             <a:fillRect/>
                           </a:stretch>
@@ -4442,17 +4820,17 @@
                 <wp:inline distB="114300" distT="114300" distL="114300" distR="114300">
                   <wp:extent cx="2724150" cy="2123997"/>
                   <wp:effectExtent b="0" l="0" r="0" t="0"/>
-                  <wp:docPr id="5" name="image12.jpg"/>
+                  <wp:docPr id="5" name="image14.jpg"/>
                   <a:graphic>
                     <a:graphicData uri="http://schemas.openxmlformats.org/drawingml/2006/picture">
                       <pic:pic>
                         <pic:nvPicPr>
-                          <pic:cNvPr id="0" name="image12.jpg"/>
+                          <pic:cNvPr id="0" name="image14.jpg"/>
                           <pic:cNvPicPr preferRelativeResize="0"/>
                         </pic:nvPicPr>
                         <pic:blipFill>
-                          <a:blip r:embed="rId22"/>
-                          <a:srcRect b="18112" l="0" r="0" t="37990"/>
+                          <a:blip r:embed="rId21"/>
+                          <a:srcRect b="18112" l="0" r="0" t="37991"/>
                           <a:stretch>
                             <a:fillRect/>
                           </a:stretch>
@@ -4558,16 +4936,16 @@
                 <wp:inline distB="114300" distT="114300" distL="114300" distR="114300">
                   <wp:extent cx="2724150" cy="1151418"/>
                   <wp:effectExtent b="0" l="0" r="0" t="0"/>
-                  <wp:docPr id="15" name="image14.jpg"/>
+                  <wp:docPr id="15" name="image21.jpg"/>
                   <a:graphic>
                     <a:graphicData uri="http://schemas.openxmlformats.org/drawingml/2006/picture">
                       <pic:pic>
                         <pic:nvPicPr>
-                          <pic:cNvPr id="0" name="image14.jpg"/>
+                          <pic:cNvPr id="0" name="image21.jpg"/>
                           <pic:cNvPicPr preferRelativeResize="0"/>
                         </pic:nvPicPr>
                         <pic:blipFill>
-                          <a:blip r:embed="rId23"/>
+                          <a:blip r:embed="rId22"/>
                           <a:srcRect b="38310" l="0" r="0" t="37867"/>
                           <a:stretch>
                             <a:fillRect/>
@@ -4662,16 +5040,16 @@
                 <wp:inline distB="114300" distT="114300" distL="114300" distR="114300">
                   <wp:extent cx="2724150" cy="1536700"/>
                   <wp:effectExtent b="0" l="0" r="0" t="0"/>
-                  <wp:docPr id="9" name="image9.jpg"/>
+                  <wp:docPr id="9" name="image10.jpg"/>
                   <a:graphic>
                     <a:graphicData uri="http://schemas.openxmlformats.org/drawingml/2006/picture">
                       <pic:pic>
                         <pic:nvPicPr>
-                          <pic:cNvPr id="0" name="image9.jpg"/>
+                          <pic:cNvPr id="0" name="image10.jpg"/>
                           <pic:cNvPicPr preferRelativeResize="0"/>
                         </pic:nvPicPr>
                         <pic:blipFill>
-                          <a:blip r:embed="rId24"/>
+                          <a:blip r:embed="rId23"/>
                           <a:srcRect b="0" l="0" r="0" t="0"/>
                           <a:stretch>
                             <a:fillRect/>
@@ -4796,17 +5174,17 @@
                 <wp:inline distB="114300" distT="114300" distL="114300" distR="114300">
                   <wp:extent cx="2724150" cy="1846580"/>
                   <wp:effectExtent b="0" l="0" r="0" t="0"/>
-                  <wp:docPr id="4" name="image19.jpg"/>
+                  <wp:docPr id="4" name="image18.jpg"/>
                   <a:graphic>
                     <a:graphicData uri="http://schemas.openxmlformats.org/drawingml/2006/picture">
                       <pic:pic>
                         <pic:nvPicPr>
-                          <pic:cNvPr id="0" name="image19.jpg"/>
+                          <pic:cNvPr id="0" name="image18.jpg"/>
                           <pic:cNvPicPr preferRelativeResize="0"/>
                         </pic:nvPicPr>
                         <pic:blipFill>
-                          <a:blip r:embed="rId25"/>
-                          <a:srcRect b="33699" l="0" r="0" t="28123"/>
+                          <a:blip r:embed="rId24"/>
+                          <a:srcRect b="33700" l="0" r="0" t="28123"/>
                           <a:stretch>
                             <a:fillRect/>
                           </a:stretch>
@@ -4865,10 +5243,10 @@
                                 <pic:cNvPicPr preferRelativeResize="0"/>
                               </pic:nvPicPr>
                               <pic:blipFill rotWithShape="1">
-                                <a:blip r:embed="rId26">
+                                <a:blip r:embed="rId25">
                                   <a:alphaModFix/>
                                 </a:blip>
-                                <a:srcRect b="34490" l="0" r="0" t="32649"/>
+                                <a:srcRect b="34490" l="0" r="0" t="32650"/>
                                 <a:stretch/>
                               </pic:blipFill>
                               <pic:spPr>
@@ -5069,7 +5447,7 @@
                               <pic:cNvPicPr preferRelativeResize="0"/>
                             </pic:nvPicPr>
                             <pic:blipFill>
-                              <a:blip r:embed="rId19"/>
+                              <a:blip r:embed="rId18"/>
                               <a:srcRect/>
                               <a:stretch>
                                 <a:fillRect/>
@@ -5167,16 +5545,16 @@
                 <wp:inline distB="114300" distT="114300" distL="114300" distR="114300">
                   <wp:extent cx="2724150" cy="1654810"/>
                   <wp:effectExtent b="0" l="0" r="0" t="0"/>
-                  <wp:docPr id="18" name="image10.jpg"/>
+                  <wp:docPr id="18" name="image19.jpg"/>
                   <a:graphic>
                     <a:graphicData uri="http://schemas.openxmlformats.org/drawingml/2006/picture">
                       <pic:pic>
                         <pic:nvPicPr>
-                          <pic:cNvPr id="0" name="image10.jpg"/>
+                          <pic:cNvPr id="0" name="image19.jpg"/>
                           <pic:cNvPicPr preferRelativeResize="0"/>
                         </pic:nvPicPr>
                         <pic:blipFill>
-                          <a:blip r:embed="rId27"/>
+                          <a:blip r:embed="rId26"/>
                           <a:srcRect b="37060" l="0" r="0" t="28740"/>
                           <a:stretch>
                             <a:fillRect/>
@@ -5259,17 +5637,17 @@
                 <wp:inline distB="114300" distT="114300" distL="114300" distR="114300">
                   <wp:extent cx="2724150" cy="2257425"/>
                   <wp:effectExtent b="0" l="0" r="0" t="0"/>
-                  <wp:docPr id="20" name="image20.jpg"/>
+                  <wp:docPr id="20" name="image11.jpg"/>
                   <a:graphic>
                     <a:graphicData uri="http://schemas.openxmlformats.org/drawingml/2006/picture">
                       <pic:pic>
                         <pic:nvPicPr>
-                          <pic:cNvPr id="0" name="image20.jpg"/>
+                          <pic:cNvPr id="0" name="image11.jpg"/>
                           <pic:cNvPicPr preferRelativeResize="0"/>
                         </pic:nvPicPr>
                         <pic:blipFill>
-                          <a:blip r:embed="rId16"/>
-                          <a:srcRect b="26968" l="0" r="0" t="26377"/>
+                          <a:blip r:embed="rId15"/>
+                          <a:srcRect b="26969" l="0" r="0" t="26378"/>
                           <a:stretch>
                             <a:fillRect/>
                           </a:stretch>
@@ -5443,7 +5821,7 @@
         </w:rPr>
         <w:t xml:space="preserve">Original Source Location: The original project source files are available online at: </w:t>
       </w:r>
-      <w:hyperlink r:id="rId28">
+      <w:hyperlink r:id="rId27">
         <w:r>
           <w:rPr>
             <w:color w:val="1155cc"/>
@@ -5473,16 +5851,16 @@
           <wp:inline distB="114300" distT="114300" distL="114300" distR="114300">
             <wp:extent cx="5514955" cy="2862026"/>
             <wp:effectExtent b="0" l="0" r="0" t="0"/>
-            <wp:docPr id="6" name="image5.png"/>
+            <wp:docPr id="6" name="image6.png"/>
             <a:graphic>
               <a:graphicData uri="http://schemas.openxmlformats.org/drawingml/2006/picture">
                 <pic:pic>
                   <pic:nvPicPr>
-                    <pic:cNvPr id="0" name="image5.png"/>
+                    <pic:cNvPr id="0" name="image6.png"/>
                     <pic:cNvPicPr preferRelativeResize="0"/>
                   </pic:nvPicPr>
                   <pic:blipFill>
-                    <a:blip r:embed="rId29"/>
+                    <a:blip r:embed="rId28"/>
                     <a:srcRect b="0" l="0" r="0" t="0"/>
                     <a:stretch>
                       <a:fillRect/>
@@ -5592,7 +5970,7 @@
         </w:rPr>
         <w:t xml:space="preserve">Complete Source Availability: The complete design files (Source), including schematics, assembly instructions, and any modifications made by Engineering Good, are available free of charge at a permanent online location:  </w:t>
       </w:r>
-      <w:hyperlink r:id="rId30">
+      <w:hyperlink r:id="rId29">
         <w:r>
           <w:rPr>
             <w:color w:val="1155cc"/>
@@ -5692,7 +6070,7 @@
         </w:rPr>
         <w:t xml:space="preserve">The full text of the license is available here:</w:t>
       </w:r>
-      <w:hyperlink r:id="rId31">
+      <w:hyperlink r:id="rId30">
         <w:r>
           <w:rPr>
             <w:rtl w:val="0"/>
@@ -5700,7 +6078,7 @@
           <w:t xml:space="preserve"> </w:t>
         </w:r>
       </w:hyperlink>
-      <w:hyperlink r:id="rId32">
+      <w:hyperlink r:id="rId31">
         <w:r>
           <w:rPr>
             <w:color w:val="1155cc"/>
@@ -5730,10 +6108,10 @@
       </w:r>
     </w:p>
     <w:sectPr>
-      <w:headerReference r:id="rId33" w:type="default"/>
-      <w:headerReference r:id="rId34" w:type="first"/>
-      <w:footerReference r:id="rId35" w:type="default"/>
-      <w:footerReference r:id="rId36" w:type="first"/>
+      <w:headerReference r:id="rId32" w:type="default"/>
+      <w:headerReference r:id="rId33" w:type="first"/>
+      <w:footerReference r:id="rId34" w:type="default"/>
+      <w:footerReference r:id="rId35" w:type="first"/>
       <w:pgSz w:h="16834" w:w="11909" w:orient="portrait"/>
       <w:pgMar w:bottom="1440" w:top="1440" w:left="1440" w:right="1440" w:header="720" w:footer="720"/>
       <w:pgNumType w:start="0"/>
@@ -5834,12 +6212,12 @@
           <wp:extent cx="900000" cy="900000"/>
           <wp:effectExtent b="0" l="0" r="0" t="0"/>
           <wp:wrapNone/>
-          <wp:docPr id="19" name="image4.png"/>
+          <wp:docPr id="19" name="image3.png"/>
           <a:graphic>
             <a:graphicData uri="http://schemas.openxmlformats.org/drawingml/2006/picture">
               <pic:pic>
                 <pic:nvPicPr>
-                  <pic:cNvPr id="0" name="image4.png"/>
+                  <pic:cNvPr id="0" name="image3.png"/>
                   <pic:cNvPicPr preferRelativeResize="0"/>
                 </pic:nvPicPr>
                 <pic:blipFill>
@@ -6588,6 +6966,7 @@
     <w:tblPr>
       <w:tblStyleRowBandSize w:val="1"/>
       <w:tblStyleColBandSize w:val="1"/>
+      <w:tblCellMar/>
     </w:tblPr>
   </w:style>
   <w:style w:type="table" w:styleId="Table3">

</xml_diff>